<commit_message>
Prepare Prastuti for open source and local development
</commit_message>
<xml_diff>
--- a/Prastuti_PRD_v1.2.docx
+++ b/Prastuti_PRD_v1.2.docx
@@ -128,7 +128,7 @@
           <w:color w:val="1F2937"/>
           <w:sz w:val="21"/>
         </w:rPr>
-        <w:t>23 July 2026</w:t>
+        <w:t>24 July 2026</w:t>
       </w:r>
     </w:p>
     <w:p>
@@ -332,6 +332,7 @@
     </w:p>
     <w:p>
       <w:pPr>
+        <w:keepLines/>
         <w:spacing w:after="160" w:line="280" w:lineRule="auto"/>
         <w:numPr>
           <w:ilvl w:val="0"/>
@@ -347,6 +348,7 @@
     </w:p>
     <w:p>
       <w:pPr>
+        <w:keepLines/>
         <w:spacing w:after="160" w:line="280" w:lineRule="auto"/>
         <w:numPr>
           <w:ilvl w:val="0"/>
@@ -362,6 +364,7 @@
     </w:p>
     <w:p>
       <w:pPr>
+        <w:keepLines/>
         <w:spacing w:after="160" w:line="280" w:lineRule="auto"/>
         <w:numPr>
           <w:ilvl w:val="0"/>
@@ -377,6 +380,7 @@
     </w:p>
     <w:p>
       <w:pPr>
+        <w:keepLines/>
         <w:spacing w:after="160" w:line="280" w:lineRule="auto"/>
         <w:numPr>
           <w:ilvl w:val="0"/>
@@ -835,6 +839,7 @@
     </w:p>
     <w:p>
       <w:pPr>
+        <w:keepLines/>
         <w:spacing w:after="160" w:line="280" w:lineRule="auto"/>
         <w:numPr>
           <w:ilvl w:val="0"/>
@@ -850,6 +855,7 @@
     </w:p>
     <w:p>
       <w:pPr>
+        <w:keepLines/>
         <w:spacing w:after="160" w:line="280" w:lineRule="auto"/>
         <w:numPr>
           <w:ilvl w:val="0"/>
@@ -865,6 +871,7 @@
     </w:p>
     <w:p>
       <w:pPr>
+        <w:keepLines/>
         <w:spacing w:after="160" w:line="280" w:lineRule="auto"/>
         <w:numPr>
           <w:ilvl w:val="0"/>
@@ -880,6 +887,7 @@
     </w:p>
     <w:p>
       <w:pPr>
+        <w:keepLines/>
         <w:spacing w:after="160" w:line="280" w:lineRule="auto"/>
         <w:numPr>
           <w:ilvl w:val="0"/>
@@ -895,6 +903,7 @@
     </w:p>
     <w:p>
       <w:pPr>
+        <w:keepLines/>
         <w:spacing w:after="160" w:line="280" w:lineRule="auto"/>
         <w:numPr>
           <w:ilvl w:val="0"/>
@@ -910,6 +919,7 @@
     </w:p>
     <w:p>
       <w:pPr>
+        <w:keepLines/>
         <w:spacing w:after="160" w:line="280" w:lineRule="auto"/>
         <w:numPr>
           <w:ilvl w:val="0"/>
@@ -925,6 +935,7 @@
     </w:p>
     <w:p>
       <w:pPr>
+        <w:keepLines/>
         <w:spacing w:after="160" w:line="280" w:lineRule="auto"/>
         <w:numPr>
           <w:ilvl w:val="0"/>
@@ -1736,6 +1747,8 @@
     </w:p>
     <w:p>
       <w:pPr>
+        <w:keepNext/>
+        <w:keepLines/>
         <w:spacing w:after="160" w:line="280" w:lineRule="auto"/>
         <w:numPr>
           <w:ilvl w:val="0"/>
@@ -1751,6 +1764,8 @@
     </w:p>
     <w:p>
       <w:pPr>
+        <w:keepNext/>
+        <w:keepLines/>
         <w:spacing w:after="160" w:line="280" w:lineRule="auto"/>
         <w:numPr>
           <w:ilvl w:val="0"/>
@@ -1766,6 +1781,8 @@
     </w:p>
     <w:p>
       <w:pPr>
+        <w:keepNext/>
+        <w:keepLines/>
         <w:spacing w:after="160" w:line="280" w:lineRule="auto"/>
         <w:numPr>
           <w:ilvl w:val="0"/>
@@ -1781,6 +1798,8 @@
     </w:p>
     <w:p>
       <w:pPr>
+        <w:keepNext w:val="0"/>
+        <w:keepLines/>
         <w:spacing w:after="160" w:line="280" w:lineRule="auto"/>
         <w:numPr>
           <w:ilvl w:val="0"/>
@@ -1812,6 +1831,7 @@
     </w:p>
     <w:p>
       <w:pPr>
+        <w:keepLines/>
         <w:spacing w:after="160" w:line="280" w:lineRule="auto"/>
         <w:numPr>
           <w:ilvl w:val="0"/>
@@ -1827,6 +1847,7 @@
     </w:p>
     <w:p>
       <w:pPr>
+        <w:keepLines/>
         <w:spacing w:after="160" w:line="280" w:lineRule="auto"/>
         <w:numPr>
           <w:ilvl w:val="0"/>
@@ -1842,6 +1863,7 @@
     </w:p>
     <w:p>
       <w:pPr>
+        <w:keepLines/>
         <w:spacing w:after="160" w:line="280" w:lineRule="auto"/>
         <w:numPr>
           <w:ilvl w:val="0"/>
@@ -1857,6 +1879,7 @@
     </w:p>
     <w:p>
       <w:pPr>
+        <w:keepLines/>
         <w:spacing w:after="160" w:line="280" w:lineRule="auto"/>
         <w:numPr>
           <w:ilvl w:val="0"/>
@@ -1872,6 +1895,7 @@
     </w:p>
     <w:p>
       <w:pPr>
+        <w:keepLines/>
         <w:spacing w:after="160" w:line="280" w:lineRule="auto"/>
         <w:numPr>
           <w:ilvl w:val="0"/>
@@ -1887,6 +1911,7 @@
     </w:p>
     <w:p>
       <w:pPr>
+        <w:keepLines/>
         <w:spacing w:after="160" w:line="280" w:lineRule="auto"/>
         <w:numPr>
           <w:ilvl w:val="0"/>
@@ -1902,6 +1927,7 @@
     </w:p>
     <w:p>
       <w:pPr>
+        <w:keepLines/>
         <w:spacing w:after="160" w:line="280" w:lineRule="auto"/>
         <w:numPr>
           <w:ilvl w:val="0"/>
@@ -1917,6 +1943,7 @@
     </w:p>
     <w:p>
       <w:pPr>
+        <w:keepLines/>
         <w:spacing w:after="160" w:line="280" w:lineRule="auto"/>
         <w:numPr>
           <w:ilvl w:val="0"/>
@@ -1940,6 +1967,7 @@
     </w:p>
     <w:p>
       <w:pPr>
+        <w:keepLines/>
         <w:spacing w:after="160" w:line="280" w:lineRule="auto"/>
         <w:numPr>
           <w:ilvl w:val="0"/>
@@ -1955,6 +1983,7 @@
     </w:p>
     <w:p>
       <w:pPr>
+        <w:keepLines/>
         <w:spacing w:after="160" w:line="280" w:lineRule="auto"/>
         <w:numPr>
           <w:ilvl w:val="0"/>
@@ -1970,6 +1999,7 @@
     </w:p>
     <w:p>
       <w:pPr>
+        <w:keepLines/>
         <w:spacing w:after="160" w:line="280" w:lineRule="auto"/>
         <w:numPr>
           <w:ilvl w:val="0"/>
@@ -1985,6 +2015,7 @@
     </w:p>
     <w:p>
       <w:pPr>
+        <w:keepLines/>
         <w:spacing w:after="160" w:line="280" w:lineRule="auto"/>
         <w:numPr>
           <w:ilvl w:val="0"/>
@@ -2000,6 +2031,7 @@
     </w:p>
     <w:p>
       <w:pPr>
+        <w:keepLines/>
         <w:spacing w:after="160" w:line="280" w:lineRule="auto"/>
         <w:numPr>
           <w:ilvl w:val="0"/>
@@ -2015,6 +2047,7 @@
     </w:p>
     <w:p>
       <w:pPr>
+        <w:keepLines/>
         <w:spacing w:after="160" w:line="280" w:lineRule="auto"/>
         <w:numPr>
           <w:ilvl w:val="0"/>
@@ -2030,6 +2063,7 @@
     </w:p>
     <w:p>
       <w:pPr>
+        <w:keepLines/>
         <w:spacing w:after="160" w:line="280" w:lineRule="auto"/>
         <w:numPr>
           <w:ilvl w:val="0"/>
@@ -4484,6 +4518,11 @@
       </w:pPr>
     </w:p>
     <w:p>
+      <w:r>
+        <w:br w:type="page"/>
+      </w:r>
+    </w:p>
+    <w:p>
       <w:pPr>
         <w:pStyle w:val="Heading2"/>
       </w:pPr>
@@ -8100,6 +8139,84 @@
           </w:p>
         </w:tc>
       </w:tr>
+      <w:tr>
+        <w:trPr>
+          <w:cantSplit/>
+        </w:trPr>
+        <w:tc>
+          <w:tcPr>
+            <w:tcW w:type="dxa" w:w="900"/>
+          </w:tcPr>
+          <w:p>
+            <w:pPr>
+              <w:spacing w:before="0" w:after="0" w:line="259" w:lineRule="auto"/>
+            </w:pPr>
+            <w:r>
+              <w:rPr>
+                <w:rFonts w:ascii="Calibri" w:hAnsi="Calibri"/>
+                <w:b/>
+                <w:color w:val="1F2937"/>
+                <w:sz w:val="18"/>
+              </w:rPr>
+              <w:t>NFR-013</w:t>
+            </w:r>
+          </w:p>
+        </w:tc>
+        <w:tc>
+          <w:tcPr>
+            <w:tcW w:type="dxa" w:w="1320"/>
+          </w:tcPr>
+          <w:p>
+            <w:pPr>
+              <w:spacing w:before="0" w:after="0" w:line="259" w:lineRule="auto"/>
+            </w:pPr>
+            <w:r>
+              <w:rPr>
+                <w:rFonts w:ascii="Calibri" w:hAnsi="Calibri"/>
+                <w:color w:val="1F2937"/>
+                <w:sz w:val="18"/>
+              </w:rPr>
+              <w:t>Local development</w:t>
+            </w:r>
+          </w:p>
+        </w:tc>
+        <w:tc>
+          <w:tcPr>
+            <w:tcW w:type="dxa" w:w="5160"/>
+          </w:tcPr>
+          <w:p>
+            <w:pPr>
+              <w:spacing w:before="0" w:after="0" w:line="259" w:lineRule="auto"/>
+            </w:pPr>
+            <w:r>
+              <w:rPr>
+                <w:rFonts w:ascii="Calibri" w:hAnsi="Calibri"/>
+                <w:color w:val="1F2937"/>
+                <w:sz w:val="18"/>
+              </w:rPr>
+              <w:t>Core product flows run and pass an automated smoke test without cloud accounts or external infrastructure.</w:t>
+            </w:r>
+          </w:p>
+        </w:tc>
+        <w:tc>
+          <w:tcPr>
+            <w:tcW w:type="dxa" w:w="1980"/>
+          </w:tcPr>
+          <w:p>
+            <w:pPr>
+              <w:spacing w:before="0" w:after="0" w:line="259" w:lineRule="auto"/>
+            </w:pPr>
+            <w:r>
+              <w:rPr>
+                <w:rFonts w:ascii="Calibri" w:hAnsi="Calibri"/>
+                <w:color w:val="1F2937"/>
+                <w:sz w:val="18"/>
+              </w:rPr>
+              <w:t>Mock-runtime smoke test</w:t>
+            </w:r>
+          </w:p>
+        </w:tc>
+      </w:tr>
     </w:tbl>
     <w:p>
       <w:pPr>
@@ -8124,6 +8241,7 @@
     </w:p>
     <w:p>
       <w:pPr>
+        <w:keepLines/>
         <w:spacing w:after="160" w:line="280" w:lineRule="auto"/>
         <w:numPr>
           <w:ilvl w:val="0"/>
@@ -8139,6 +8257,7 @@
     </w:p>
     <w:p>
       <w:pPr>
+        <w:keepLines/>
         <w:spacing w:after="160" w:line="280" w:lineRule="auto"/>
         <w:numPr>
           <w:ilvl w:val="0"/>
@@ -8154,6 +8273,7 @@
     </w:p>
     <w:p>
       <w:pPr>
+        <w:keepLines/>
         <w:spacing w:after="160" w:line="280" w:lineRule="auto"/>
         <w:numPr>
           <w:ilvl w:val="0"/>
@@ -8169,6 +8289,7 @@
     </w:p>
     <w:p>
       <w:pPr>
+        <w:keepLines/>
         <w:spacing w:after="160" w:line="280" w:lineRule="auto"/>
         <w:numPr>
           <w:ilvl w:val="0"/>
@@ -8184,6 +8305,7 @@
     </w:p>
     <w:p>
       <w:pPr>
+        <w:keepLines/>
         <w:spacing w:after="160" w:line="280" w:lineRule="auto"/>
         <w:numPr>
           <w:ilvl w:val="0"/>
@@ -8199,6 +8321,7 @@
     </w:p>
     <w:p>
       <w:pPr>
+        <w:keepLines/>
         <w:spacing w:after="160" w:line="280" w:lineRule="auto"/>
         <w:numPr>
           <w:ilvl w:val="0"/>
@@ -8214,6 +8337,7 @@
     </w:p>
     <w:p>
       <w:pPr>
+        <w:keepLines/>
         <w:spacing w:after="160" w:line="280" w:lineRule="auto"/>
         <w:numPr>
           <w:ilvl w:val="0"/>
@@ -8229,6 +8353,7 @@
     </w:p>
     <w:p>
       <w:pPr>
+        <w:keepLines/>
         <w:spacing w:after="160" w:line="280" w:lineRule="auto"/>
         <w:numPr>
           <w:ilvl w:val="0"/>
@@ -8244,6 +8369,7 @@
     </w:p>
     <w:p>
       <w:pPr>
+        <w:keepLines/>
         <w:spacing w:after="160" w:line="280" w:lineRule="auto"/>
         <w:numPr>
           <w:ilvl w:val="0"/>
@@ -8255,6 +8381,22 @@
           <w:rFonts w:ascii="Calibri" w:hAnsi="Calibri"/>
         </w:rPr>
         <w:t>Presenter and attendee browsers connect directly to managed speech and realtime providers using event-scoped, short-lived credentials issued by the control plane.</w:t>
+      </w:r>
+    </w:p>
+    <w:p>
+      <w:pPr>
+        <w:keepLines/>
+        <w:spacing w:after="160" w:line="280" w:lineRule="auto"/>
+        <w:numPr>
+          <w:ilvl w:val="0"/>
+          <w:numId w:val="10"/>
+        </w:numPr>
+      </w:pPr>
+      <w:r>
+        <w:rPr>
+          <w:rFonts w:ascii="Calibri" w:hAnsi="Calibri"/>
+        </w:rPr>
+        <w:t>Development defaults to deterministic mock adapters; optional Docker-backed PostgreSQL and Valkey support persistence integration without changing production provider boundaries.</w:t>
       </w:r>
     </w:p>
     <w:p>
@@ -8633,6 +8775,47 @@
                 <w:sz w:val="18"/>
               </w:rPr>
               <w:t>Serverless PostgreSQL, object storage, ephemeral coordination, transcript/segment store, and analytics.</w:t>
+            </w:r>
+          </w:p>
+        </w:tc>
+      </w:tr>
+      <w:tr>
+        <w:trPr>
+          <w:cantSplit/>
+        </w:trPr>
+        <w:tc>
+          <w:tcPr>
+            <w:tcW w:type="dxa" w:w="2520"/>
+          </w:tcPr>
+          <w:p>
+            <w:pPr>
+              <w:spacing w:before="0" w:after="0" w:line="259" w:lineRule="auto"/>
+            </w:pPr>
+            <w:r>
+              <w:rPr>
+                <w:rFonts w:ascii="Calibri" w:hAnsi="Calibri"/>
+                <w:color w:val="1F2937"/>
+                <w:sz w:val="18"/>
+              </w:rPr>
+              <w:t>Local product runtime</w:t>
+            </w:r>
+          </w:p>
+        </w:tc>
+        <w:tc>
+          <w:tcPr>
+            <w:tcW w:type="dxa" w:w="6840"/>
+          </w:tcPr>
+          <w:p>
+            <w:pPr>
+              <w:spacing w:before="0" w:after="0" w:line="259" w:lineRule="auto"/>
+            </w:pPr>
+            <w:r>
+              <w:rPr>
+                <w:rFonts w:ascii="Calibri" w:hAnsi="Calibri"/>
+                <w:color w:val="1F2937"/>
+                <w:sz w:val="18"/>
+              </w:rPr>
+              <w:t>Deterministic mock adapters plus optional Docker-backed PostgreSQL and Valkey for contributor verification.</w:t>
             </w:r>
           </w:p>
         </w:tc>
@@ -9224,6 +9407,47 @@
                 <w:sz w:val="18"/>
               </w:rPr>
               <w:t>Vercel serverless deployment in India region with managed marketplace storage and no custom always-on compute</w:t>
+            </w:r>
+          </w:p>
+        </w:tc>
+      </w:tr>
+      <w:tr>
+        <w:trPr>
+          <w:cantSplit/>
+        </w:trPr>
+        <w:tc>
+          <w:tcPr>
+            <w:tcW w:type="dxa" w:w="2520"/>
+          </w:tcPr>
+          <w:p>
+            <w:pPr>
+              <w:spacing w:before="0" w:after="0" w:line="259" w:lineRule="auto"/>
+            </w:pPr>
+            <w:r>
+              <w:rPr>
+                <w:rFonts w:ascii="Calibri" w:hAnsi="Calibri"/>
+                <w:color w:val="1F2937"/>
+                <w:sz w:val="18"/>
+              </w:rPr>
+              <w:t>Local verification</w:t>
+            </w:r>
+          </w:p>
+        </w:tc>
+        <w:tc>
+          <w:tcPr>
+            <w:tcW w:type="dxa" w:w="6840"/>
+          </w:tcPr>
+          <w:p>
+            <w:pPr>
+              <w:spacing w:before="0" w:after="0" w:line="259" w:lineRule="auto"/>
+            </w:pPr>
+            <w:r>
+              <w:rPr>
+                <w:rFonts w:ascii="Calibri" w:hAnsi="Calibri"/>
+                <w:color w:val="1F2937"/>
+                <w:sz w:val="18"/>
+              </w:rPr>
+              <w:t>Infrastructure-free mock runtime for product flows; Docker Compose PostgreSQL and Valkey for persistence and coordination integration</w:t>
             </w:r>
           </w:p>
         </w:tc>
@@ -9903,6 +10127,7 @@
     </w:p>
     <w:p>
       <w:pPr>
+        <w:keepLines/>
         <w:spacing w:after="160" w:line="280" w:lineRule="auto"/>
         <w:numPr>
           <w:ilvl w:val="0"/>
@@ -9918,6 +10143,7 @@
     </w:p>
     <w:p>
       <w:pPr>
+        <w:keepLines/>
         <w:spacing w:after="160" w:line="280" w:lineRule="auto"/>
         <w:numPr>
           <w:ilvl w:val="0"/>
@@ -9933,6 +10159,7 @@
     </w:p>
     <w:p>
       <w:pPr>
+        <w:keepLines/>
         <w:spacing w:after="160" w:line="280" w:lineRule="auto"/>
         <w:numPr>
           <w:ilvl w:val="0"/>
@@ -9948,6 +10175,7 @@
     </w:p>
     <w:p>
       <w:pPr>
+        <w:keepLines/>
         <w:spacing w:after="160" w:line="280" w:lineRule="auto"/>
         <w:numPr>
           <w:ilvl w:val="0"/>
@@ -9963,6 +10191,7 @@
     </w:p>
     <w:p>
       <w:pPr>
+        <w:keepLines/>
         <w:spacing w:after="160" w:line="280" w:lineRule="auto"/>
         <w:numPr>
           <w:ilvl w:val="0"/>
@@ -9978,6 +10207,7 @@
     </w:p>
     <w:p>
       <w:pPr>
+        <w:keepLines/>
         <w:spacing w:after="160" w:line="280" w:lineRule="auto"/>
         <w:numPr>
           <w:ilvl w:val="0"/>
@@ -9993,6 +10223,7 @@
     </w:p>
     <w:p>
       <w:pPr>
+        <w:keepLines/>
         <w:spacing w:after="160" w:line="280" w:lineRule="auto"/>
         <w:numPr>
           <w:ilvl w:val="0"/>
@@ -10008,6 +10239,7 @@
     </w:p>
     <w:p>
       <w:pPr>
+        <w:keepLines/>
         <w:spacing w:after="160" w:line="280" w:lineRule="auto"/>
         <w:numPr>
           <w:ilvl w:val="0"/>
@@ -10023,6 +10255,7 @@
     </w:p>
     <w:p>
       <w:pPr>
+        <w:keepLines/>
         <w:spacing w:after="160" w:line="280" w:lineRule="auto"/>
         <w:numPr>
           <w:ilvl w:val="0"/>
@@ -10038,6 +10271,7 @@
     </w:p>
     <w:p>
       <w:pPr>
+        <w:keepLines/>
         <w:spacing w:after="160" w:line="280" w:lineRule="auto"/>
         <w:numPr>
           <w:ilvl w:val="0"/>
@@ -10982,7 +11216,7 @@
                 <w:color w:val="1F2937"/>
                 <w:sz w:val="18"/>
               </w:rPr>
-              <w:t>Provider bake-off; code-switching corpus; transport prototype; latency/cost model; privacy review.</w:t>
+              <w:t>Provider bake-off; code-switching corpus; transport feasibility implementation; latency/cost model; privacy review.</w:t>
             </w:r>
           </w:p>
         </w:tc>
@@ -11411,6 +11645,7 @@
     </w:p>
     <w:p>
       <w:pPr>
+        <w:keepLines/>
         <w:spacing w:after="160" w:line="280" w:lineRule="auto"/>
         <w:numPr>
           <w:ilvl w:val="0"/>
@@ -11426,6 +11661,7 @@
     </w:p>
     <w:p>
       <w:pPr>
+        <w:keepLines/>
         <w:spacing w:after="160" w:line="280" w:lineRule="auto"/>
         <w:numPr>
           <w:ilvl w:val="0"/>
@@ -11441,6 +11677,7 @@
     </w:p>
     <w:p>
       <w:pPr>
+        <w:keepLines/>
         <w:spacing w:after="160" w:line="280" w:lineRule="auto"/>
         <w:numPr>
           <w:ilvl w:val="0"/>
@@ -11456,6 +11693,7 @@
     </w:p>
     <w:p>
       <w:pPr>
+        <w:keepLines/>
         <w:spacing w:after="160" w:line="280" w:lineRule="auto"/>
         <w:numPr>
           <w:ilvl w:val="0"/>
@@ -11471,6 +11709,7 @@
     </w:p>
     <w:p>
       <w:pPr>
+        <w:keepLines/>
         <w:spacing w:after="160" w:line="280" w:lineRule="auto"/>
         <w:numPr>
           <w:ilvl w:val="0"/>
@@ -11486,6 +11725,7 @@
     </w:p>
     <w:p>
       <w:pPr>
+        <w:keepLines/>
         <w:spacing w:after="160" w:line="280" w:lineRule="auto"/>
         <w:numPr>
           <w:ilvl w:val="0"/>
@@ -11501,6 +11741,7 @@
     </w:p>
     <w:p>
       <w:pPr>
+        <w:keepLines/>
         <w:spacing w:after="160" w:line="280" w:lineRule="auto"/>
         <w:numPr>
           <w:ilvl w:val="0"/>
@@ -11516,6 +11757,7 @@
     </w:p>
     <w:p>
       <w:pPr>
+        <w:keepLines/>
         <w:spacing w:after="160" w:line="280" w:lineRule="auto"/>
         <w:numPr>
           <w:ilvl w:val="0"/>
@@ -12093,6 +12335,8 @@
     </w:p>
     <w:p>
       <w:pPr>
+        <w:keepNext/>
+        <w:keepLines/>
         <w:spacing w:after="160" w:line="280" w:lineRule="auto"/>
         <w:numPr>
           <w:ilvl w:val="0"/>
@@ -12108,6 +12352,8 @@
     </w:p>
     <w:p>
       <w:pPr>
+        <w:keepNext/>
+        <w:keepLines/>
         <w:spacing w:after="160" w:line="280" w:lineRule="auto"/>
         <w:numPr>
           <w:ilvl w:val="0"/>
@@ -12123,6 +12369,8 @@
     </w:p>
     <w:p>
       <w:pPr>
+        <w:keepNext/>
+        <w:keepLines/>
         <w:spacing w:after="160" w:line="280" w:lineRule="auto"/>
         <w:numPr>
           <w:ilvl w:val="0"/>
@@ -12138,6 +12386,8 @@
     </w:p>
     <w:p>
       <w:pPr>
+        <w:keepNext/>
+        <w:keepLines/>
         <w:spacing w:after="160" w:line="280" w:lineRule="auto"/>
         <w:numPr>
           <w:ilvl w:val="0"/>
@@ -12153,6 +12403,8 @@
     </w:p>
     <w:p>
       <w:pPr>
+        <w:keepNext/>
+        <w:keepLines/>
         <w:spacing w:after="160" w:line="280" w:lineRule="auto"/>
         <w:numPr>
           <w:ilvl w:val="0"/>
@@ -12168,6 +12420,8 @@
     </w:p>
     <w:p>
       <w:pPr>
+        <w:keepNext w:val="0"/>
+        <w:keepLines/>
         <w:spacing w:after="160" w:line="280" w:lineRule="auto"/>
         <w:numPr>
           <w:ilvl w:val="0"/>
@@ -14151,6 +14405,47 @@
                 <w:color w:val="1F2937"/>
                 <w:sz w:val="18"/>
               </w:rPr>
+              <w:t>Local development</w:t>
+            </w:r>
+          </w:p>
+        </w:tc>
+        <w:tc>
+          <w:tcPr>
+            <w:tcW w:type="dxa" w:w="7200"/>
+          </w:tcPr>
+          <w:p>
+            <w:pPr>
+              <w:spacing w:before="0" w:after="0" w:line="259" w:lineRule="auto"/>
+            </w:pPr>
+            <w:r>
+              <w:rPr>
+                <w:rFonts w:ascii="Calibri" w:hAnsi="Calibri"/>
+                <w:color w:val="1F2937"/>
+                <w:sz w:val="18"/>
+              </w:rPr>
+              <w:t>A contributor can run core product flows and the automated smoke test without cloud credentials; Docker-backed migrations pass separately.</w:t>
+            </w:r>
+          </w:p>
+        </w:tc>
+      </w:tr>
+      <w:tr>
+        <w:trPr>
+          <w:cantSplit/>
+        </w:trPr>
+        <w:tc>
+          <w:tcPr>
+            <w:tcW w:type="dxa" w:w="2160"/>
+          </w:tcPr>
+          <w:p>
+            <w:pPr>
+              <w:spacing w:before="0" w:after="0" w:line="259" w:lineRule="auto"/>
+            </w:pPr>
+            <w:r>
+              <w:rPr>
+                <w:rFonts w:ascii="Calibri" w:hAnsi="Calibri"/>
+                <w:color w:val="1F2937"/>
+                <w:sz w:val="18"/>
+              </w:rPr>
               <w:t>Operations</w:t>
             </w:r>
           </w:p>
@@ -14239,6 +14534,7 @@
     </w:p>
     <w:p>
       <w:pPr>
+        <w:keepLines/>
         <w:spacing w:after="160" w:line="280" w:lineRule="auto"/>
         <w:numPr>
           <w:ilvl w:val="0"/>
@@ -14254,6 +14550,7 @@
     </w:p>
     <w:p>
       <w:pPr>
+        <w:keepLines/>
         <w:spacing w:after="160" w:line="280" w:lineRule="auto"/>
         <w:numPr>
           <w:ilvl w:val="0"/>
@@ -14269,6 +14566,7 @@
     </w:p>
     <w:p>
       <w:pPr>
+        <w:keepLines/>
         <w:spacing w:after="160" w:line="280" w:lineRule="auto"/>
         <w:numPr>
           <w:ilvl w:val="0"/>
@@ -14284,6 +14582,7 @@
     </w:p>
     <w:p>
       <w:pPr>
+        <w:keepLines/>
         <w:spacing w:after="160" w:line="280" w:lineRule="auto"/>
         <w:numPr>
           <w:ilvl w:val="0"/>
@@ -14299,6 +14598,7 @@
     </w:p>
     <w:p>
       <w:pPr>
+        <w:keepLines/>
         <w:spacing w:after="160" w:line="280" w:lineRule="auto"/>
         <w:numPr>
           <w:ilvl w:val="0"/>
@@ -14314,6 +14614,7 @@
     </w:p>
     <w:p>
       <w:pPr>
+        <w:keepLines/>
         <w:spacing w:after="160" w:line="280" w:lineRule="auto"/>
         <w:numPr>
           <w:ilvl w:val="0"/>
@@ -14329,6 +14630,7 @@
     </w:p>
     <w:p>
       <w:pPr>
+        <w:keepLines/>
         <w:spacing w:after="160" w:line="280" w:lineRule="auto"/>
         <w:numPr>
           <w:ilvl w:val="0"/>
@@ -14344,6 +14646,7 @@
     </w:p>
     <w:p>
       <w:pPr>
+        <w:keepLines/>
         <w:spacing w:after="160" w:line="280" w:lineRule="auto"/>
         <w:numPr>
           <w:ilvl w:val="0"/>
@@ -14359,6 +14662,7 @@
     </w:p>
     <w:p>
       <w:pPr>
+        <w:keepLines/>
         <w:spacing w:after="160" w:line="280" w:lineRule="auto"/>
         <w:numPr>
           <w:ilvl w:val="0"/>
@@ -15353,7 +15657,7 @@
         <w:rPr>
           <w:rFonts w:ascii="Calibri" w:hAnsi="Calibri"/>
         </w:rPr>
-        <w:t>This PRD was derived from the supplied VaaniLive concept brief, renamed to Prastuti, and revised for a plan-free prepaid credit model plus an all-TypeScript, serverless-first application stack targeting scale-to-zero compute. Competitive, provider, and research references below are discovery inputs and should be independently validated before procurement or public claims.</w:t>
+        <w:t>This PRD was derived from the supplied VaaniLive source brief, renamed to Prastuti, and revised for a plan-free prepaid credit model plus an all-TypeScript, serverless-first application stack targeting scale-to-zero compute. It now includes an infrastructure-free contributor runtime and optional Docker-backed integration services. Competitive, provider, and research references below are discovery inputs and should be independently validated before procurement or public claims.</w:t>
       </w:r>
     </w:p>
     <w:p>

</xml_diff>